<commit_message>
added more to the Apprenticeship folder
</commit_message>
<xml_diff>
--- a/Misc/Exposure_Plan.docx
+++ b/Misc/Exposure_Plan.docx
@@ -29,6 +29,12 @@
       <w:r>
         <w:t>, is there any way I could get time with testers/ developers to look at an area of slowdown in the business, to make it faster eg dataloads, pain points for speed for customers</w:t>
       </w:r>
+      <w:r>
+        <w:t>, could do some analysis on runtime of certain programs etc</w:t>
+      </w:r>
+      <w:r>
+        <w:t xml:space="preserve"> MAYBE MEET WITH TESTERS OR IMPROVE SEARCHLIGHT</w:t>
+      </w:r>
     </w:p>
     <w:p>
       <w:pPr>
@@ -41,6 +47,9 @@
       <w:r>
         <w:t>Asynchronous programming, similar to the above, is there anything that can be done here to improve the speed and performance of things?</w:t>
       </w:r>
+      <w:r>
+        <w:t xml:space="preserve"> An ideal area for this sort of work would be to improve the timing of the Searchlight pipelines, I already have a job card to handle this</w:t>
+      </w:r>
     </w:p>
     <w:p>
       <w:pPr>
@@ -53,6 +62,9 @@
       <w:r>
         <w:t>Design Patterns, is there a project I could start in which I could implement particular design patterns, eg building, singleton, dependency injection, strategy, factories, functional programming</w:t>
       </w:r>
+      <w:r>
+        <w:t>, Strategy Pattern with defined strategies for different things could be trialled in Searchlight?</w:t>
+      </w:r>
     </w:p>
     <w:p>
       <w:pPr>
@@ -65,6 +77,9 @@
       <w:r>
         <w:t>Class diagrams, ERD. This would relate to the above scenario. If there is a way that a cheap database could be provisioned, would it be possible to create an ERD for the relational database.</w:t>
       </w:r>
+      <w:r>
+        <w:t xml:space="preserve"> MAKE CLASS DIAGRAMS/ DIAGRAM WITH NOSQL STRUCTURE/ MAKE SURE A PARTICULAR SCHEMA IS BEING FOLLOWED</w:t>
+      </w:r>
     </w:p>
     <w:p>
       <w:pPr>
@@ -75,7 +90,28 @@
         </w:numPr>
       </w:pPr>
       <w:r>
+        <w:t>Design documentation, I suppose me and David are doing this already with the pipelines. I could also look into architectural design for a particular system.</w:t>
+      </w:r>
+      <w:r>
+        <w:t xml:space="preserve"> DR DOCUMENTATION PUT IN</w:t>
+      </w:r>
+      <w:r>
+        <w:t>, MAKE ARCHITECTURAL DIAGRAM FOR ALAN</w:t>
+      </w:r>
+    </w:p>
+    <w:p>
+      <w:pPr>
+        <w:pStyle w:val="ListParagraph"/>
+        <w:numPr>
+          <w:ilvl w:val="0"/>
+          <w:numId w:val="1"/>
+        </w:numPr>
+      </w:pPr>
+      <w:r>
         <w:t>Agile, would there be a way to implement better practices. More controlled and tighter standups? Integrating the ops review tickets on TopDesk in order to remove the need for a meeting for ops review? Is there a way to have a retro to identify blockers and remove them as a matter of principle?</w:t>
+      </w:r>
+      <w:r>
+        <w:t xml:space="preserve"> RUN A RETRO, CAN TOPDESK TICKETS BE MOVED TO THE STANDUP?</w:t>
       </w:r>
     </w:p>
     <w:p/>

</xml_diff>